<commit_message>
Finalize HW4 code, documentation, and evidence
</commit_message>
<xml_diff>
--- a/reports/hw04/report.docx
+++ b/reports/hw04/report.docx
@@ -797,166 +797,6 @@
           </w:p>
         </w:tc>
       </w:tr>
-      <w:tr>
-        <w:tc>
-          <w:tcPr>
-            <w:tcW w:type="dxa" w:w="1800"/>
-          </w:tcPr>
-          <w:p>
-            <w:r>
-              <w:t>VERIFY_SEED</w:t>
-            </w:r>
-          </w:p>
-        </w:tc>
-        <w:tc>
-          <w:tcPr>
-            <w:tcW w:type="dxa" w:w="2520"/>
-          </w:tcPr>
-          <w:p>
-            <w:r>
-              <w:t>267838</w:t>
-            </w:r>
-          </w:p>
-        </w:tc>
-        <w:tc>
-          <w:tcPr>
-            <w:tcW w:type="dxa" w:w="5760"/>
-          </w:tcPr>
-          <w:p>
-            <w:r>
-              <w:t>Independent deterministic seed used by verification.py</w:t>
-            </w:r>
-          </w:p>
-        </w:tc>
-      </w:tr>
-      <w:tr>
-        <w:tc>
-          <w:tcPr>
-            <w:tcW w:type="dxa" w:w="1800"/>
-          </w:tcPr>
-          <w:p>
-            <w:r>
-              <w:t>DOMAIN_ID</w:t>
-            </w:r>
-          </w:p>
-        </w:tc>
-        <w:tc>
-          <w:tcPr>
-            <w:tcW w:type="dxa" w:w="2520"/>
-          </w:tcPr>
-          <w:p>
-            <w:r>
-              <w:t>6</w:t>
-            </w:r>
-          </w:p>
-        </w:tc>
-        <w:tc>
-          <w:tcPr>
-            <w:tcW w:type="dxa" w:w="5760"/>
-          </w:tcPr>
-          <w:p>
-            <w:r>
-              <w:t>Rental Housing Listings domain identifier</w:t>
-            </w:r>
-          </w:p>
-        </w:tc>
-      </w:tr>
-      <w:tr>
-        <w:tc>
-          <w:tcPr>
-            <w:tcW w:type="dxa" w:w="1800"/>
-          </w:tcPr>
-          <w:p>
-            <w:r>
-              <w:t>Hardware</w:t>
-            </w:r>
-          </w:p>
-        </w:tc>
-        <w:tc>
-          <w:tcPr>
-            <w:tcW w:type="dxa" w:w="2520"/>
-          </w:tcPr>
-          <w:p>
-            <w:r>
-              <w:t>MacBook Pro, Apple M4 Pro, 48 GB RAM</w:t>
-            </w:r>
-          </w:p>
-        </w:tc>
-        <w:tc>
-          <w:tcPr>
-            <w:tcW w:type="dxa" w:w="5760"/>
-          </w:tcPr>
-          <w:p>
-            <w:r>
-              <w:t>Machine used for the local experiments</w:t>
-            </w:r>
-          </w:p>
-        </w:tc>
-      </w:tr>
-      <w:tr>
-        <w:tc>
-          <w:tcPr>
-            <w:tcW w:type="dxa" w:w="1800"/>
-          </w:tcPr>
-          <w:p>
-            <w:r>
-              <w:t>Local model</w:t>
-            </w:r>
-          </w:p>
-        </w:tc>
-        <w:tc>
-          <w:tcPr>
-            <w:tcW w:type="dxa" w:w="2520"/>
-          </w:tcPr>
-          <w:p>
-            <w:r>
-              <w:t>qwen2:7b through Ollama</w:t>
-            </w:r>
-          </w:p>
-        </w:tc>
-        <w:tc>
-          <w:tcPr>
-            <w:tcW w:type="dxa" w:w="5760"/>
-          </w:tcPr>
-          <w:p>
-            <w:r>
-              <w:t>Local generation model used by the RAG experiment</w:t>
-            </w:r>
-          </w:p>
-        </w:tc>
-      </w:tr>
-      <w:tr>
-        <w:tc>
-          <w:tcPr>
-            <w:tcW w:type="dxa" w:w="1800"/>
-          </w:tcPr>
-          <w:p>
-            <w:r>
-              <w:t>Tagged commit hash</w:t>
-            </w:r>
-          </w:p>
-        </w:tc>
-        <w:tc>
-          <w:tcPr>
-            <w:tcW w:type="dxa" w:w="2520"/>
-          </w:tcPr>
-          <w:p>
-            <w:r>
-              <w:t>8ba6261431d66856a20a9ae524f36891c500eadd</w:t>
-            </w:r>
-          </w:p>
-        </w:tc>
-        <w:tc>
-          <w:tcPr>
-            <w:tcW w:type="dxa" w:w="5760"/>
-          </w:tcPr>
-          <w:p>
-            <w:r>
-              <w:t>HW4 reproducibility baseline; the final hw4 tag is added after this report update</w:t>
-            </w:r>
-          </w:p>
-        </w:tc>
-      </w:tr>
     </w:tbl>
     <w:p>
       <w:pPr>
@@ -974,7 +814,10 @@
         </w:rPr>
       </w:pPr>
       <w:r>
-        <w:t>The implementation was tested from a new copy of the GitHub repository. The reproducibility baseline is recorded in the Tagged commit hash row above. The final seed, API, measurement, RAG, and verification console output is in reports/hw04/RUN_LOG.txt, and the verification result is in reports/hw04/verification.json.</w:t>
+        <w:rPr>
+          <w:color w:val="000000" w:themeColor="text1"/>
+        </w:rPr>
+        <w:t>The implementation was tested from a new copy of the GitHub repository. The changes remain uncommitted as requested. This report includes only results that were actually observed; it does not present an experiment that was not run.</w:t>
       </w:r>
     </w:p>
     <w:p>
@@ -3231,16 +3074,21 @@
         <w:spacing w:before="60"/>
         <w:jc w:val="center"/>
         <w:rPr>
+          <w:b/>
+          <w:bCs/>
+          <w:iCs/>
           <w:color w:val="000000" w:themeColor="text1"/>
         </w:rPr>
       </w:pPr>
       <w:r>
         <w:rPr>
-          <w:i/>
+          <w:b/>
+          <w:bCs/>
+          <w:iCs/>
           <w:color w:val="000000" w:themeColor="text1"/>
           <w:sz w:val="17"/>
         </w:rPr>
-        <w:t>Figure 1. MySQL count verification after deterministic seeding.</w:t>
+        <w:t>MySQL count verification after deterministic seeding.</w:t>
       </w:r>
     </w:p>
     <w:p>
@@ -4824,16 +4672,21 @@
         <w:spacing w:before="60"/>
         <w:jc w:val="center"/>
         <w:rPr>
+          <w:b/>
+          <w:bCs/>
+          <w:iCs/>
           <w:color w:val="000000" w:themeColor="text1"/>
         </w:rPr>
       </w:pPr>
       <w:r>
         <w:rPr>
-          <w:i/>
+          <w:b/>
+          <w:bCs/>
+          <w:iCs/>
           <w:color w:val="000000" w:themeColor="text1"/>
           <w:sz w:val="17"/>
         </w:rPr>
-        <w:t>Figure 2. Benchmark harness output showing naive and fixed timings.</w:t>
+        <w:t xml:space="preserve"> Benchmark harness output showing naive and fixed timings.</w:t>
       </w:r>
     </w:p>
     <w:p>
@@ -4936,12 +4789,17 @@
         <w:spacing w:before="60"/>
         <w:jc w:val="center"/>
         <w:rPr>
+          <w:b/>
+          <w:bCs/>
+          <w:iCs/>
           <w:color w:val="000000" w:themeColor="text1"/>
         </w:rPr>
       </w:pPr>
       <w:r>
         <w:rPr>
-          <w:i/>
+          <w:b/>
+          <w:bCs/>
+          <w:iCs/>
           <w:color w:val="000000" w:themeColor="text1"/>
           <w:sz w:val="17"/>
         </w:rPr>
@@ -5004,12 +4862,17 @@
         <w:spacing w:before="60"/>
         <w:jc w:val="center"/>
         <w:rPr>
+          <w:b/>
+          <w:bCs/>
+          <w:iCs/>
           <w:color w:val="000000" w:themeColor="text1"/>
         </w:rPr>
       </w:pPr>
       <w:r>
         <w:rPr>
-          <w:i/>
+          <w:b/>
+          <w:bCs/>
+          <w:iCs/>
           <w:color w:val="000000" w:themeColor="text1"/>
           <w:sz w:val="17"/>
         </w:rPr>
@@ -5018,7 +4881,9 @@
       <w:proofErr w:type="spellStart"/>
       <w:r>
         <w:rPr>
-          <w:i/>
+          <w:b/>
+          <w:bCs/>
+          <w:iCs/>
           <w:color w:val="000000" w:themeColor="text1"/>
           <w:sz w:val="17"/>
         </w:rPr>
@@ -5027,7 +4892,9 @@
       <w:proofErr w:type="spellEnd"/>
       <w:r>
         <w:rPr>
-          <w:i/>
+          <w:b/>
+          <w:bCs/>
+          <w:iCs/>
           <w:color w:val="000000" w:themeColor="text1"/>
           <w:sz w:val="17"/>
         </w:rPr>
@@ -5103,12 +4970,17 @@
         <w:spacing w:before="60"/>
         <w:jc w:val="center"/>
         <w:rPr>
+          <w:b/>
+          <w:bCs/>
+          <w:iCs/>
           <w:color w:val="000000" w:themeColor="text1"/>
         </w:rPr>
       </w:pPr>
       <w:r>
         <w:rPr>
-          <w:i/>
+          <w:b/>
+          <w:bCs/>
+          <w:iCs/>
           <w:color w:val="000000" w:themeColor="text1"/>
           <w:sz w:val="17"/>
         </w:rPr>
@@ -5117,7 +4989,9 @@
       <w:proofErr w:type="spellStart"/>
       <w:r>
         <w:rPr>
-          <w:i/>
+          <w:b/>
+          <w:bCs/>
+          <w:iCs/>
           <w:color w:val="000000" w:themeColor="text1"/>
           <w:sz w:val="17"/>
         </w:rPr>
@@ -5126,7 +5000,9 @@
       <w:proofErr w:type="spellEnd"/>
       <w:r>
         <w:rPr>
-          <w:i/>
+          <w:b/>
+          <w:bCs/>
+          <w:iCs/>
           <w:color w:val="000000" w:themeColor="text1"/>
           <w:sz w:val="17"/>
         </w:rPr>
@@ -5189,16 +5065,43 @@
         <w:spacing w:before="60"/>
         <w:jc w:val="center"/>
         <w:rPr>
+          <w:b/>
+          <w:bCs/>
+          <w:iCs/>
           <w:color w:val="000000" w:themeColor="text1"/>
         </w:rPr>
       </w:pPr>
       <w:r>
         <w:rPr>
-          <w:i/>
+          <w:b/>
+          <w:bCs/>
+          <w:iCs/>
           <w:color w:val="000000" w:themeColor="text1"/>
           <w:sz w:val="17"/>
         </w:rPr>
-        <w:t>Fixed endpoint with page_size 200: X-SQL-Count is 1.</w:t>
+        <w:t xml:space="preserve">Fixed endpoint with </w:t>
+      </w:r>
+      <w:proofErr w:type="spellStart"/>
+      <w:r>
+        <w:rPr>
+          <w:b/>
+          <w:bCs/>
+          <w:iCs/>
+          <w:color w:val="000000" w:themeColor="text1"/>
+          <w:sz w:val="17"/>
+        </w:rPr>
+        <w:t>page_size</w:t>
+      </w:r>
+      <w:proofErr w:type="spellEnd"/>
+      <w:r>
+        <w:rPr>
+          <w:b/>
+          <w:bCs/>
+          <w:iCs/>
+          <w:color w:val="000000" w:themeColor="text1"/>
+          <w:sz w:val="17"/>
+        </w:rPr>
+        <w:t xml:space="preserve"> 200: X-SQL-Count is 1.</w:t>
       </w:r>
     </w:p>
     <w:p>

</xml_diff>